<commit_message>
Perform data cleaning on all source files
</commit_message>
<xml_diff>
--- a/Hospital Pharmacy Dashboard.docx
+++ b/Hospital Pharmacy Dashboard.docx
@@ -315,8 +315,6 @@
         </w:rPr>
         <w:t xml:space="preserve">- </w:t>
       </w:r>
-      <w:bookmarkStart w:id="0" w:name="_GoBack"/>
-      <w:bookmarkEnd w:id="0"/>
       <w:r>
         <w:rPr>
           <w:rFonts w:asciiTheme="minorBidi" w:hAnsiTheme="minorBidi"/>
@@ -471,6 +469,7 @@
     </w:p>
     <w:p>
       <w:pPr>
+        <w:spacing w:line="360" w:lineRule="auto"/>
         <w:rPr>
           <w:rFonts w:asciiTheme="minorBidi" w:hAnsiTheme="minorBidi"/>
           <w:sz w:val="28"/>
@@ -504,6 +503,7 @@
     </w:p>
     <w:p>
       <w:pPr>
+        <w:spacing w:line="360" w:lineRule="auto"/>
         <w:rPr>
           <w:rFonts w:asciiTheme="minorBidi" w:hAnsiTheme="minorBidi"/>
           <w:sz w:val="28"/>
@@ -542,6 +542,7 @@
           <w:ilvl w:val="0"/>
           <w:numId w:val="176"/>
         </w:numPr>
+        <w:spacing w:line="360" w:lineRule="auto"/>
         <w:rPr>
           <w:rFonts w:asciiTheme="minorBidi" w:hAnsiTheme="minorBidi"/>
           <w:sz w:val="28"/>
@@ -564,6 +565,7 @@
           <w:ilvl w:val="0"/>
           <w:numId w:val="176"/>
         </w:numPr>
+        <w:spacing w:line="360" w:lineRule="auto"/>
         <w:rPr>
           <w:rFonts w:asciiTheme="minorBidi" w:hAnsiTheme="minorBidi"/>
           <w:sz w:val="28"/>
@@ -586,6 +588,7 @@
           <w:ilvl w:val="0"/>
           <w:numId w:val="176"/>
         </w:numPr>
+        <w:spacing w:line="360" w:lineRule="auto"/>
         <w:rPr>
           <w:rFonts w:asciiTheme="minorBidi" w:hAnsiTheme="minorBidi"/>
           <w:sz w:val="28"/>
@@ -608,6 +611,7 @@
           <w:ilvl w:val="0"/>
           <w:numId w:val="176"/>
         </w:numPr>
+        <w:spacing w:line="360" w:lineRule="auto"/>
         <w:rPr>
           <w:rFonts w:asciiTheme="minorBidi" w:hAnsiTheme="minorBidi"/>
           <w:sz w:val="28"/>
@@ -625,6 +629,362 @@
     </w:p>
     <w:p>
       <w:pPr>
+        <w:spacing w:line="360" w:lineRule="auto"/>
+        <w:rPr>
+          <w:rFonts w:asciiTheme="minorBidi" w:hAnsiTheme="minorBidi"/>
+          <w:sz w:val="28"/>
+          <w:szCs w:val="28"/>
+        </w:rPr>
+      </w:pPr>
+    </w:p>
+    <w:p>
+      <w:pPr>
+        <w:spacing w:line="360" w:lineRule="auto"/>
+        <w:rPr>
+          <w:rFonts w:asciiTheme="minorBidi" w:hAnsiTheme="minorBidi"/>
+          <w:sz w:val="28"/>
+          <w:szCs w:val="28"/>
+          <w:u w:val="single"/>
+        </w:rPr>
+      </w:pPr>
+      <w:r>
+        <w:rPr>
+          <w:rFonts w:asciiTheme="minorBidi" w:hAnsiTheme="minorBidi"/>
+          <w:sz w:val="28"/>
+          <w:szCs w:val="28"/>
+          <w:u w:val="single"/>
+        </w:rPr>
+        <w:t>Data Cleaning</w:t>
+      </w:r>
+      <w:r>
+        <w:rPr>
+          <w:rFonts w:asciiTheme="minorBidi" w:hAnsiTheme="minorBidi"/>
+          <w:sz w:val="28"/>
+          <w:szCs w:val="28"/>
+          <w:u w:val="single"/>
+        </w:rPr>
+        <w:t>:</w:t>
+      </w:r>
+      <w:bookmarkStart w:id="0" w:name="_GoBack"/>
+      <w:bookmarkEnd w:id="0"/>
+    </w:p>
+    <w:p>
+      <w:pPr>
+        <w:spacing w:line="360" w:lineRule="auto"/>
+        <w:rPr>
+          <w:rFonts w:asciiTheme="minorBidi" w:hAnsiTheme="minorBidi"/>
+          <w:sz w:val="28"/>
+          <w:szCs w:val="28"/>
+        </w:rPr>
+      </w:pPr>
+      <w:r>
+        <w:rPr>
+          <w:rFonts w:asciiTheme="minorBidi" w:hAnsiTheme="minorBidi"/>
+          <w:sz w:val="28"/>
+          <w:szCs w:val="28"/>
+        </w:rPr>
+        <w:t>I went through all the 4 files one by one, and did these steps:</w:t>
+      </w:r>
+    </w:p>
+    <w:p>
+      <w:pPr>
+        <w:spacing w:line="360" w:lineRule="auto"/>
+        <w:rPr>
+          <w:rFonts w:asciiTheme="minorBidi" w:hAnsiTheme="minorBidi"/>
+          <w:sz w:val="28"/>
+          <w:szCs w:val="28"/>
+        </w:rPr>
+      </w:pPr>
+      <w:r>
+        <w:rPr>
+          <w:rFonts w:asciiTheme="minorBidi" w:hAnsiTheme="minorBidi"/>
+          <w:sz w:val="28"/>
+          <w:szCs w:val="28"/>
+        </w:rPr>
+        <w:t>-</w:t>
+      </w:r>
+      <w:r>
+        <w:rPr>
+          <w:rFonts w:asciiTheme="minorBidi" w:hAnsiTheme="minorBidi"/>
+          <w:sz w:val="28"/>
+          <w:szCs w:val="28"/>
+        </w:rPr>
+        <w:tab/>
+        <w:t>Removed empty rows and duplicates from within the data block.</w:t>
+      </w:r>
+    </w:p>
+    <w:p>
+      <w:pPr>
+        <w:spacing w:line="360" w:lineRule="auto"/>
+        <w:rPr>
+          <w:rFonts w:asciiTheme="minorBidi" w:hAnsiTheme="minorBidi"/>
+          <w:sz w:val="28"/>
+          <w:szCs w:val="28"/>
+        </w:rPr>
+      </w:pPr>
+      <w:r>
+        <w:rPr>
+          <w:rFonts w:asciiTheme="minorBidi" w:hAnsiTheme="minorBidi"/>
+          <w:sz w:val="28"/>
+          <w:szCs w:val="28"/>
+        </w:rPr>
+        <w:lastRenderedPageBreak/>
+        <w:t>-</w:t>
+      </w:r>
+      <w:r>
+        <w:rPr>
+          <w:rFonts w:asciiTheme="minorBidi" w:hAnsiTheme="minorBidi"/>
+          <w:sz w:val="28"/>
+          <w:szCs w:val="28"/>
+        </w:rPr>
+        <w:tab/>
+        <w:t>Deleted empty columns from within the data block.</w:t>
+      </w:r>
+    </w:p>
+    <w:p>
+      <w:pPr>
+        <w:spacing w:line="360" w:lineRule="auto"/>
+        <w:rPr>
+          <w:rFonts w:asciiTheme="minorBidi" w:hAnsiTheme="minorBidi"/>
+          <w:sz w:val="28"/>
+          <w:szCs w:val="28"/>
+        </w:rPr>
+      </w:pPr>
+      <w:r>
+        <w:rPr>
+          <w:rFonts w:asciiTheme="minorBidi" w:hAnsiTheme="minorBidi"/>
+          <w:sz w:val="28"/>
+          <w:szCs w:val="28"/>
+        </w:rPr>
+        <w:t>-</w:t>
+      </w:r>
+      <w:r>
+        <w:rPr>
+          <w:rFonts w:asciiTheme="minorBidi" w:hAnsiTheme="minorBidi"/>
+          <w:sz w:val="28"/>
+          <w:szCs w:val="28"/>
+        </w:rPr>
+        <w:tab/>
+        <w:t xml:space="preserve">Deleted all extra empty rows outside the data block in all files. </w:t>
+      </w:r>
+    </w:p>
+    <w:p>
+      <w:pPr>
+        <w:spacing w:line="360" w:lineRule="auto"/>
+        <w:rPr>
+          <w:rFonts w:asciiTheme="minorBidi" w:hAnsiTheme="minorBidi"/>
+          <w:sz w:val="28"/>
+          <w:szCs w:val="28"/>
+        </w:rPr>
+      </w:pPr>
+      <w:r>
+        <w:rPr>
+          <w:rFonts w:asciiTheme="minorBidi" w:hAnsiTheme="minorBidi"/>
+          <w:sz w:val="28"/>
+          <w:szCs w:val="28"/>
+        </w:rPr>
+        <w:t xml:space="preserve">    o</w:t>
+      </w:r>
+      <w:r>
+        <w:rPr>
+          <w:rFonts w:asciiTheme="minorBidi" w:hAnsiTheme="minorBidi"/>
+          <w:sz w:val="28"/>
+          <w:szCs w:val="28"/>
+        </w:rPr>
+        <w:tab/>
+      </w:r>
+      <w:proofErr w:type="gramStart"/>
+      <w:r>
+        <w:rPr>
+          <w:rFonts w:asciiTheme="minorBidi" w:hAnsiTheme="minorBidi"/>
+          <w:sz w:val="28"/>
+          <w:szCs w:val="28"/>
+        </w:rPr>
+        <w:t>In</w:t>
+      </w:r>
+      <w:proofErr w:type="gramEnd"/>
+      <w:r>
+        <w:rPr>
+          <w:rFonts w:asciiTheme="minorBidi" w:hAnsiTheme="minorBidi"/>
+          <w:sz w:val="28"/>
+          <w:szCs w:val="28"/>
+        </w:rPr>
+        <w:t xml:space="preserve"> “pharmacy store 31-06-2026.xls” table, found 228 columns by 39 rows = 8892 Extra No Data cells. File size dropped from 27 MB to 4 MB. Smaller file size in memory works faster.</w:t>
+      </w:r>
+    </w:p>
+    <w:p>
+      <w:pPr>
+        <w:spacing w:line="360" w:lineRule="auto"/>
+        <w:rPr>
+          <w:rFonts w:asciiTheme="minorBidi" w:hAnsiTheme="minorBidi"/>
+          <w:sz w:val="28"/>
+          <w:szCs w:val="28"/>
+        </w:rPr>
+      </w:pPr>
+      <w:r>
+        <w:rPr>
+          <w:rFonts w:asciiTheme="minorBidi" w:hAnsiTheme="minorBidi"/>
+          <w:sz w:val="28"/>
+          <w:szCs w:val="28"/>
+        </w:rPr>
+        <w:t>-</w:t>
+      </w:r>
+      <w:r>
+        <w:rPr>
+          <w:rFonts w:asciiTheme="minorBidi" w:hAnsiTheme="minorBidi"/>
+          <w:sz w:val="28"/>
+          <w:szCs w:val="28"/>
+        </w:rPr>
+        <w:tab/>
+        <w:t>Trimmed whitespace from text fields, like double spaces among words, I used Excel search and replace.</w:t>
+      </w:r>
+    </w:p>
+    <w:p>
+      <w:pPr>
+        <w:spacing w:line="360" w:lineRule="auto"/>
+        <w:rPr>
+          <w:rFonts w:asciiTheme="minorBidi" w:hAnsiTheme="minorBidi"/>
+          <w:sz w:val="28"/>
+          <w:szCs w:val="28"/>
+        </w:rPr>
+      </w:pPr>
+      <w:r>
+        <w:rPr>
+          <w:rFonts w:asciiTheme="minorBidi" w:hAnsiTheme="minorBidi"/>
+          <w:sz w:val="28"/>
+          <w:szCs w:val="28"/>
+        </w:rPr>
+        <w:t>-</w:t>
+      </w:r>
+      <w:r>
+        <w:rPr>
+          <w:rFonts w:asciiTheme="minorBidi" w:hAnsiTheme="minorBidi"/>
+          <w:sz w:val="28"/>
+          <w:szCs w:val="28"/>
+        </w:rPr>
+        <w:tab/>
+        <w:t>Standardize date formats.</w:t>
+      </w:r>
+    </w:p>
+    <w:p>
+      <w:pPr>
+        <w:spacing w:line="360" w:lineRule="auto"/>
+        <w:rPr>
+          <w:rFonts w:asciiTheme="minorBidi" w:hAnsiTheme="minorBidi"/>
+          <w:sz w:val="28"/>
+          <w:szCs w:val="28"/>
+        </w:rPr>
+      </w:pPr>
+      <w:r>
+        <w:rPr>
+          <w:rFonts w:asciiTheme="minorBidi" w:hAnsiTheme="minorBidi"/>
+          <w:sz w:val="28"/>
+          <w:szCs w:val="28"/>
+        </w:rPr>
+        <w:t xml:space="preserve">     o</w:t>
+      </w:r>
+      <w:r>
+        <w:rPr>
+          <w:rFonts w:asciiTheme="minorBidi" w:hAnsiTheme="minorBidi"/>
+          <w:sz w:val="28"/>
+          <w:szCs w:val="28"/>
+        </w:rPr>
+        <w:tab/>
+        <w:t xml:space="preserve">   In Expired items table, found 4 rows with “31/12/9999” date, replaced with the above row date, for simplicity. But actually, that date requires correction because   the Expiry Date is a health hazard. </w:t>
+      </w:r>
+    </w:p>
+    <w:p>
+      <w:pPr>
+        <w:spacing w:line="360" w:lineRule="auto"/>
+        <w:rPr>
+          <w:rFonts w:asciiTheme="minorBidi" w:hAnsiTheme="minorBidi"/>
+          <w:sz w:val="28"/>
+          <w:szCs w:val="28"/>
+        </w:rPr>
+      </w:pPr>
+      <w:r>
+        <w:rPr>
+          <w:rFonts w:asciiTheme="minorBidi" w:hAnsiTheme="minorBidi"/>
+          <w:sz w:val="28"/>
+          <w:szCs w:val="28"/>
+        </w:rPr>
+        <w:t>-</w:t>
+      </w:r>
+      <w:r>
+        <w:rPr>
+          <w:rFonts w:asciiTheme="minorBidi" w:hAnsiTheme="minorBidi"/>
+          <w:sz w:val="28"/>
+          <w:szCs w:val="28"/>
+        </w:rPr>
+        <w:tab/>
+        <w:t>Handled null values (replace with 0 for quantities).</w:t>
+      </w:r>
+    </w:p>
+    <w:p>
+      <w:pPr>
+        <w:spacing w:line="360" w:lineRule="auto"/>
+        <w:rPr>
+          <w:rFonts w:asciiTheme="minorBidi" w:hAnsiTheme="minorBidi"/>
+          <w:sz w:val="28"/>
+          <w:szCs w:val="28"/>
+        </w:rPr>
+      </w:pPr>
+      <w:r>
+        <w:rPr>
+          <w:rFonts w:asciiTheme="minorBidi" w:hAnsiTheme="minorBidi"/>
+          <w:sz w:val="28"/>
+          <w:szCs w:val="28"/>
+        </w:rPr>
+        <w:t>-</w:t>
+      </w:r>
+      <w:r>
+        <w:rPr>
+          <w:rFonts w:asciiTheme="minorBidi" w:hAnsiTheme="minorBidi"/>
+          <w:sz w:val="28"/>
+          <w:szCs w:val="28"/>
+        </w:rPr>
+        <w:tab/>
+        <w:t>Validate data types (numeric, text, date).</w:t>
+      </w:r>
+    </w:p>
+    <w:p>
+      <w:pPr>
+        <w:spacing w:line="360" w:lineRule="auto"/>
+        <w:rPr>
+          <w:rFonts w:asciiTheme="minorBidi" w:hAnsiTheme="minorBidi"/>
+          <w:sz w:val="28"/>
+          <w:szCs w:val="28"/>
+        </w:rPr>
+      </w:pPr>
+      <w:r>
+        <w:rPr>
+          <w:rFonts w:asciiTheme="minorBidi" w:hAnsiTheme="minorBidi"/>
+          <w:sz w:val="28"/>
+          <w:szCs w:val="28"/>
+        </w:rPr>
+        <w:t>-</w:t>
+      </w:r>
+      <w:r>
+        <w:rPr>
+          <w:rFonts w:asciiTheme="minorBidi" w:hAnsiTheme="minorBidi"/>
+          <w:sz w:val="28"/>
+          <w:szCs w:val="28"/>
+        </w:rPr>
+        <w:tab/>
+        <w:t>Renamed some columns, to English equivalent, to avoid language conflict.</w:t>
+      </w:r>
+    </w:p>
+    <w:p>
+      <w:pPr>
+        <w:rPr>
+          <w:rFonts w:asciiTheme="minorBidi" w:hAnsiTheme="minorBidi"/>
+          <w:sz w:val="28"/>
+          <w:szCs w:val="28"/>
+        </w:rPr>
+      </w:pPr>
+    </w:p>
+    <w:p>
+      <w:pPr>
         <w:rPr>
           <w:rFonts w:asciiTheme="minorBidi" w:hAnsiTheme="minorBidi"/>
           <w:sz w:val="28"/>
@@ -768,7 +1128,6 @@
           <w:szCs w:val="32"/>
           <w:u w:val="single"/>
         </w:rPr>
-        <w:lastRenderedPageBreak/>
         <w:t xml:space="preserve">3- </w:t>
       </w:r>
       <w:r>
@@ -809,7 +1168,16 @@
           <w:sz w:val="28"/>
           <w:szCs w:val="28"/>
         </w:rPr>
-        <w:t>Next is an approximate prototype layout, the current charts have close to real numbers in the Excel data files. As long as these are prototypes, the actual Powe</w:t>
+        <w:t xml:space="preserve">Next is an approximate prototype layout, the current charts have close to real numbers in the Excel data files. As long as these are prototypes, the </w:t>
+      </w:r>
+      <w:r>
+        <w:rPr>
+          <w:rFonts w:asciiTheme="minorBidi" w:hAnsiTheme="minorBidi"/>
+          <w:sz w:val="28"/>
+          <w:szCs w:val="28"/>
+        </w:rPr>
+        <w:lastRenderedPageBreak/>
+        <w:t>actual Powe</w:t>
       </w:r>
       <w:r>
         <w:rPr>

</xml_diff>